<commit_message>
style: optimize cross-paragraph warning text and fix Chinese font-family fallback rendering in preview
</commit_message>
<xml_diff>
--- a/代理商授权函_北京航嘉鸿信科技发展有限公司.docx
+++ b/代理商授权函_北京航嘉鸿信科技发展有限公司.docx
@@ -1,6 +1,6 @@
 
 <file path=word/document.xml><?xml version="1.0" encoding="utf-8"?>
-<w:document xmlns:wpc="http://schemas.microsoft.com/office/word/2010/wordprocessingCanvas" xmlns:cx="http://schemas.microsoft.com/office/drawing/2014/chartex" xmlns:cx1="http://schemas.microsoft.com/office/drawing/2015/9/8/chartex" xmlns:cx2="http://schemas.microsoft.com/office/drawing/2015/10/21/chartex" xmlns:cx3="http://schemas.microsoft.com/office/drawing/2016/5/9/chartex" xmlns:cx4="http://schemas.microsoft.com/office/drawing/2016/5/10/chartex" xmlns:cx5="http://schemas.microsoft.com/office/drawing/2016/5/11/chartex" xmlns:cx6="http://schemas.microsoft.com/office/drawing/2016/5/12/chartex" xmlns:cx7="http://schemas.microsoft.com/office/drawing/2016/5/13/chartex" xmlns:cx8="http://schemas.microsoft.com/office/drawing/2016/5/14/chartex" xmlns:mc="http://schemas.openxmlformats.org/markup-compatibility/2006" xmlns:aink="http://schemas.microsoft.com/office/drawing/2016/ink" xmlns:am3d="http://schemas.microsoft.com/office/drawing/2017/model3d" xmlns:o="urn:schemas-microsoft-com:office:office" xmlns:r="http://schemas.openxmlformats.org/officeDocument/2006/relationships" xmlns:m="http://schemas.openxmlformats.org/officeDocument/2006/math" xmlns:v="urn:schemas-microsoft-com:vml" xmlns:wp14="http://schemas.microsoft.com/office/word/2010/wordprocessingDrawing" xmlns:wp="http://schemas.openxmlformats.org/drawingml/2006/wordprocessingDrawing" xmlns:w10="urn:schemas-microsoft-com:office:word" xmlns:w="http://schemas.openxmlformats.org/wordprocessingml/2006/main" xmlns:w14="http://schemas.microsoft.com/office/word/2010/wordml" xmlns:w15="http://schemas.microsoft.com/office/word/2012/wordml" xmlns:w16cex="http://schemas.microsoft.com/office/word/2018/wordml/cex" xmlns:w16cid="http://schemas.microsoft.com/office/word/2016/wordml/cid" xmlns:w16="http://schemas.microsoft.com/office/word/2018/wordml" xmlns:w16sdtdh="http://schemas.microsoft.com/office/word/2020/wordml/sdtdatahash" xmlns:w16se="http://schemas.microsoft.com/office/word/2015/wordml/symex" xmlns:wpg="http://schemas.microsoft.com/office/word/2010/wordprocessingGroup" xmlns:wpi="http://schemas.microsoft.com/office/word/2010/wordprocessingInk" xmlns:wne="http://schemas.microsoft.com/office/word/2006/wordml" xmlns:wps="http://schemas.microsoft.com/office/word/2010/wordprocessingShape" mc:Ignorable="w14 w15 w16se w16cid w16 w16cex w16sdtdh wp14">
+<w:document xmlns:wpc="http://schemas.microsoft.com/office/word/2010/wordprocessingCanvas" xmlns:cx="http://schemas.microsoft.com/office/drawing/2014/chartex" xmlns:cx1="http://schemas.microsoft.com/office/drawing/2015/9/8/chartex" xmlns:cx2="http://schemas.microsoft.com/office/drawing/2015/10/21/chartex" xmlns:cx3="http://schemas.microsoft.com/office/drawing/2016/5/9/chartex" xmlns:cx4="http://schemas.microsoft.com/office/drawing/2016/5/10/chartex" xmlns:cx5="http://schemas.microsoft.com/office/drawing/2016/5/11/chartex" xmlns:cx6="http://schemas.microsoft.com/office/drawing/2016/5/12/chartex" xmlns:cx7="http://schemas.microsoft.com/office/drawing/2016/5/13/chartex" xmlns:cx8="http://schemas.microsoft.com/office/drawing/2016/5/14/chartex" xmlns:mc="http://schemas.openxmlformats.org/markup-compatibility/2006" xmlns:aink="http://schemas.microsoft.com/office/drawing/2016/ink" xmlns:am3d="http://schemas.microsoft.com/office/drawing/2017/model3d" xmlns:o="urn:schemas-microsoft-com:office:office" xmlns:oel="http://schemas.microsoft.com/office/2019/extlst" xmlns:r="http://schemas.openxmlformats.org/officeDocument/2006/relationships" xmlns:m="http://schemas.openxmlformats.org/officeDocument/2006/math" xmlns:v="urn:schemas-microsoft-com:vml" xmlns:wp14="http://schemas.microsoft.com/office/word/2010/wordprocessingDrawing" xmlns:wp="http://schemas.openxmlformats.org/drawingml/2006/wordprocessingDrawing" xmlns:w10="urn:schemas-microsoft-com:office:word" xmlns:w="http://schemas.openxmlformats.org/wordprocessingml/2006/main" xmlns:w14="http://schemas.microsoft.com/office/word/2010/wordml" xmlns:w15="http://schemas.microsoft.com/office/word/2012/wordml" xmlns:w16cex="http://schemas.microsoft.com/office/word/2018/wordml/cex" xmlns:w16cid="http://schemas.microsoft.com/office/word/2016/wordml/cid" xmlns:w16="http://schemas.microsoft.com/office/word/2018/wordml" xmlns:w16du="http://schemas.microsoft.com/office/word/2023/wordml/word16du" xmlns:w16sdtdh="http://schemas.microsoft.com/office/word/2020/wordml/sdtdatahash" xmlns:w16sdtfl="http://schemas.microsoft.com/office/word/2024/wordml/sdtformatlock" xmlns:w16se="http://schemas.microsoft.com/office/word/2015/wordml/symex" xmlns:wpg="http://schemas.microsoft.com/office/word/2010/wordprocessingGroup" xmlns:wpi="http://schemas.microsoft.com/office/word/2010/wordprocessingInk" xmlns:wne="http://schemas.microsoft.com/office/word/2006/wordml" xmlns:wps="http://schemas.microsoft.com/office/word/2010/wordprocessingShape" mc:Ignorable="w14 w15 w16se w16cid w16 w16cex w16sdtdh w16sdtfl w16du wp14">
   <w:body>
     <w:p>
       <w:pPr>
@@ -28,7 +28,7 @@
         <w:ind w:left="3103"/>
         <w:outlineLvl w:val="0"/>
         <w:rPr>
-          <w:rFonts w:ascii="黑体" w:eastAsia="黑体" w:hAnsi="黑体" w:cs="黑体"/>
+          <w:rFonts w:ascii="黑体" w:eastAsia="黑体" w:hAnsi="黑体" w:cs="黑体" w:hint="eastAsia"/>
           <w:sz w:val="43"/>
           <w:szCs w:val="43"/>
           <w:lang w:eastAsia="zh-CN"/>
@@ -66,6 +66,7 @@
         <w:spacing w:before="78" w:line="220" w:lineRule="auto"/>
         <w:ind w:left="23"/>
         <w:rPr>
+          <w:rFonts w:hint="eastAsia"/>
           <w:lang w:eastAsia="zh-CN"/>
         </w:rPr>
       </w:pPr>
@@ -98,6 +99,7 @@
         <w:spacing w:before="175" w:line="354" w:lineRule="auto"/>
         <w:ind w:firstLine="481"/>
         <w:rPr>
+          <w:rFonts w:hint="eastAsia"/>
           <w:lang w:eastAsia="zh-CN"/>
         </w:rPr>
       </w:pPr>
@@ -254,6 +256,7 @@
         <w:ind w:right="68"/>
         <w:jc w:val="right"/>
         <w:rPr>
+          <w:rFonts w:hint="eastAsia"/>
           <w:spacing w:val="-2"/>
           <w:u w:val="single"/>
           <w:lang w:eastAsia="zh-CN"/>
@@ -295,6 +298,7 @@
         <w:spacing w:before="1" w:line="218" w:lineRule="auto"/>
         <w:ind w:left="4"/>
         <w:rPr>
+          <w:rFonts w:hint="eastAsia"/>
           <w:lang w:eastAsia="zh-CN"/>
         </w:rPr>
       </w:pPr>
@@ -356,6 +360,7 @@
         <w:spacing w:before="176" w:line="219" w:lineRule="auto"/>
         <w:ind w:left="441"/>
         <w:rPr>
+          <w:rFonts w:hint="eastAsia"/>
           <w:lang w:eastAsia="zh-CN"/>
         </w:rPr>
       </w:pPr>
@@ -380,6 +385,7 @@
         <w:spacing w:before="173" w:line="355" w:lineRule="auto"/>
         <w:ind w:left="5" w:right="64" w:firstLine="436"/>
         <w:rPr>
+          <w:rFonts w:hint="eastAsia"/>
           <w:lang w:eastAsia="zh-CN"/>
         </w:rPr>
       </w:pPr>
@@ -420,6 +426,7 @@
         <w:spacing w:before="175" w:line="354" w:lineRule="auto"/>
         <w:ind w:right="66" w:firstLine="441"/>
         <w:rPr>
+          <w:rFonts w:hint="eastAsia"/>
           <w:lang w:eastAsia="zh-CN"/>
         </w:rPr>
       </w:pPr>
@@ -540,6 +547,7 @@
         <w:spacing w:before="163" w:line="219" w:lineRule="auto"/>
         <w:ind w:left="436"/>
         <w:rPr>
+          <w:rFonts w:hint="eastAsia"/>
           <w:lang w:eastAsia="zh-CN"/>
         </w:rPr>
       </w:pPr>
@@ -656,6 +664,7 @@
         <w:ind w:right="64"/>
         <w:jc w:val="right"/>
         <w:rPr>
+          <w:rFonts w:hint="eastAsia"/>
           <w:lang w:eastAsia="zh-CN"/>
         </w:rPr>
       </w:pPr>
@@ -674,6 +683,7 @@
         <w:spacing w:line="220" w:lineRule="auto"/>
         <w:ind w:left="6967"/>
         <w:rPr>
+          <w:rFonts w:hint="eastAsia"/>
           <w:lang w:eastAsia="zh-CN"/>
         </w:rPr>
       </w:pPr>
@@ -702,7 +712,7 @@
 </file>
 
 <file path=word/endnotes.xml><?xml version="1.0" encoding="utf-8"?>
-<w:endnotes xmlns:wpc="http://schemas.microsoft.com/office/word/2010/wordprocessingCanvas" xmlns:cx="http://schemas.microsoft.com/office/drawing/2014/chartex" xmlns:cx1="http://schemas.microsoft.com/office/drawing/2015/9/8/chartex" xmlns:cx2="http://schemas.microsoft.com/office/drawing/2015/10/21/chartex" xmlns:cx3="http://schemas.microsoft.com/office/drawing/2016/5/9/chartex" xmlns:cx4="http://schemas.microsoft.com/office/drawing/2016/5/10/chartex" xmlns:cx5="http://schemas.microsoft.com/office/drawing/2016/5/11/chartex" xmlns:cx6="http://schemas.microsoft.com/office/drawing/2016/5/12/chartex" xmlns:cx7="http://schemas.microsoft.com/office/drawing/2016/5/13/chartex" xmlns:cx8="http://schemas.microsoft.com/office/drawing/2016/5/14/chartex" xmlns:mc="http://schemas.openxmlformats.org/markup-compatibility/2006" xmlns:aink="http://schemas.microsoft.com/office/drawing/2016/ink" xmlns:am3d="http://schemas.microsoft.com/office/drawing/2017/model3d" xmlns:o="urn:schemas-microsoft-com:office:office" xmlns:r="http://schemas.openxmlformats.org/officeDocument/2006/relationships" xmlns:m="http://schemas.openxmlformats.org/officeDocument/2006/math" xmlns:v="urn:schemas-microsoft-com:vml" xmlns:wp14="http://schemas.microsoft.com/office/word/2010/wordprocessingDrawing" xmlns:wp="http://schemas.openxmlformats.org/drawingml/2006/wordprocessingDrawing" xmlns:w10="urn:schemas-microsoft-com:office:word" xmlns:w="http://schemas.openxmlformats.org/wordprocessingml/2006/main" xmlns:w14="http://schemas.microsoft.com/office/word/2010/wordml" xmlns:w15="http://schemas.microsoft.com/office/word/2012/wordml" xmlns:w16cex="http://schemas.microsoft.com/office/word/2018/wordml/cex" xmlns:w16cid="http://schemas.microsoft.com/office/word/2016/wordml/cid" xmlns:w16="http://schemas.microsoft.com/office/word/2018/wordml" xmlns:w16sdtdh="http://schemas.microsoft.com/office/word/2020/wordml/sdtdatahash" xmlns:w16se="http://schemas.microsoft.com/office/word/2015/wordml/symex" xmlns:wpg="http://schemas.microsoft.com/office/word/2010/wordprocessingGroup" xmlns:wpi="http://schemas.microsoft.com/office/word/2010/wordprocessingInk" xmlns:wne="http://schemas.microsoft.com/office/word/2006/wordml" xmlns:wps="http://schemas.microsoft.com/office/word/2010/wordprocessingShape" mc:Ignorable="w14 w15 w16se w16cid w16 w16cex w16sdtdh wp14">
+<w:endnotes xmlns:wpc="http://schemas.microsoft.com/office/word/2010/wordprocessingCanvas" xmlns:cx="http://schemas.microsoft.com/office/drawing/2014/chartex" xmlns:cx1="http://schemas.microsoft.com/office/drawing/2015/9/8/chartex" xmlns:cx2="http://schemas.microsoft.com/office/drawing/2015/10/21/chartex" xmlns:cx3="http://schemas.microsoft.com/office/drawing/2016/5/9/chartex" xmlns:cx4="http://schemas.microsoft.com/office/drawing/2016/5/10/chartex" xmlns:cx5="http://schemas.microsoft.com/office/drawing/2016/5/11/chartex" xmlns:cx6="http://schemas.microsoft.com/office/drawing/2016/5/12/chartex" xmlns:cx7="http://schemas.microsoft.com/office/drawing/2016/5/13/chartex" xmlns:cx8="http://schemas.microsoft.com/office/drawing/2016/5/14/chartex" xmlns:mc="http://schemas.openxmlformats.org/markup-compatibility/2006" xmlns:aink="http://schemas.microsoft.com/office/drawing/2016/ink" xmlns:am3d="http://schemas.microsoft.com/office/drawing/2017/model3d" xmlns:o="urn:schemas-microsoft-com:office:office" xmlns:oel="http://schemas.microsoft.com/office/2019/extlst" xmlns:r="http://schemas.openxmlformats.org/officeDocument/2006/relationships" xmlns:m="http://schemas.openxmlformats.org/officeDocument/2006/math" xmlns:v="urn:schemas-microsoft-com:vml" xmlns:wp14="http://schemas.microsoft.com/office/word/2010/wordprocessingDrawing" xmlns:wp="http://schemas.openxmlformats.org/drawingml/2006/wordprocessingDrawing" xmlns:w10="urn:schemas-microsoft-com:office:word" xmlns:w="http://schemas.openxmlformats.org/wordprocessingml/2006/main" xmlns:w14="http://schemas.microsoft.com/office/word/2010/wordml" xmlns:w15="http://schemas.microsoft.com/office/word/2012/wordml" xmlns:w16cex="http://schemas.microsoft.com/office/word/2018/wordml/cex" xmlns:w16cid="http://schemas.microsoft.com/office/word/2016/wordml/cid" xmlns:w16="http://schemas.microsoft.com/office/word/2018/wordml" xmlns:w16du="http://schemas.microsoft.com/office/word/2023/wordml/word16du" xmlns:w16sdtdh="http://schemas.microsoft.com/office/word/2020/wordml/sdtdatahash" xmlns:w16sdtfl="http://schemas.microsoft.com/office/word/2024/wordml/sdtformatlock" xmlns:w16se="http://schemas.microsoft.com/office/word/2015/wordml/symex" xmlns:wpg="http://schemas.microsoft.com/office/word/2010/wordprocessingGroup" xmlns:wpi="http://schemas.microsoft.com/office/word/2010/wordprocessingInk" xmlns:wne="http://schemas.microsoft.com/office/word/2006/wordml" xmlns:wps="http://schemas.microsoft.com/office/word/2010/wordprocessingShape" mc:Ignorable="w14 w15 w16se w16cid w16 w16cex w16sdtdh w16sdtfl w16du wp14">
   <w:endnote w:type="separator" w:id="-1">
     <w:p>
       <w:r>
@@ -721,7 +731,7 @@
 </file>
 
 <file path=word/footnotes.xml><?xml version="1.0" encoding="utf-8"?>
-<w:footnotes xmlns:wpc="http://schemas.microsoft.com/office/word/2010/wordprocessingCanvas" xmlns:cx="http://schemas.microsoft.com/office/drawing/2014/chartex" xmlns:cx1="http://schemas.microsoft.com/office/drawing/2015/9/8/chartex" xmlns:cx2="http://schemas.microsoft.com/office/drawing/2015/10/21/chartex" xmlns:cx3="http://schemas.microsoft.com/office/drawing/2016/5/9/chartex" xmlns:cx4="http://schemas.microsoft.com/office/drawing/2016/5/10/chartex" xmlns:cx5="http://schemas.microsoft.com/office/drawing/2016/5/11/chartex" xmlns:cx6="http://schemas.microsoft.com/office/drawing/2016/5/12/chartex" xmlns:cx7="http://schemas.microsoft.com/office/drawing/2016/5/13/chartex" xmlns:cx8="http://schemas.microsoft.com/office/drawing/2016/5/14/chartex" xmlns:mc="http://schemas.openxmlformats.org/markup-compatibility/2006" xmlns:aink="http://schemas.microsoft.com/office/drawing/2016/ink" xmlns:am3d="http://schemas.microsoft.com/office/drawing/2017/model3d" xmlns:o="urn:schemas-microsoft-com:office:office" xmlns:r="http://schemas.openxmlformats.org/officeDocument/2006/relationships" xmlns:m="http://schemas.openxmlformats.org/officeDocument/2006/math" xmlns:v="urn:schemas-microsoft-com:vml" xmlns:wp14="http://schemas.microsoft.com/office/word/2010/wordprocessingDrawing" xmlns:wp="http://schemas.openxmlformats.org/drawingml/2006/wordprocessingDrawing" xmlns:w10="urn:schemas-microsoft-com:office:word" xmlns:w="http://schemas.openxmlformats.org/wordprocessingml/2006/main" xmlns:w14="http://schemas.microsoft.com/office/word/2010/wordml" xmlns:w15="http://schemas.microsoft.com/office/word/2012/wordml" xmlns:w16cex="http://schemas.microsoft.com/office/word/2018/wordml/cex" xmlns:w16cid="http://schemas.microsoft.com/office/word/2016/wordml/cid" xmlns:w16="http://schemas.microsoft.com/office/word/2018/wordml" xmlns:w16sdtdh="http://schemas.microsoft.com/office/word/2020/wordml/sdtdatahash" xmlns:w16se="http://schemas.microsoft.com/office/word/2015/wordml/symex" xmlns:wpg="http://schemas.microsoft.com/office/word/2010/wordprocessingGroup" xmlns:wpi="http://schemas.microsoft.com/office/word/2010/wordprocessingInk" xmlns:wne="http://schemas.microsoft.com/office/word/2006/wordml" xmlns:wps="http://schemas.microsoft.com/office/word/2010/wordprocessingShape" mc:Ignorable="w14 w15 w16se w16cid w16 w16cex w16sdtdh wp14">
+<w:footnotes xmlns:wpc="http://schemas.microsoft.com/office/word/2010/wordprocessingCanvas" xmlns:cx="http://schemas.microsoft.com/office/drawing/2014/chartex" xmlns:cx1="http://schemas.microsoft.com/office/drawing/2015/9/8/chartex" xmlns:cx2="http://schemas.microsoft.com/office/drawing/2015/10/21/chartex" xmlns:cx3="http://schemas.microsoft.com/office/drawing/2016/5/9/chartex" xmlns:cx4="http://schemas.microsoft.com/office/drawing/2016/5/10/chartex" xmlns:cx5="http://schemas.microsoft.com/office/drawing/2016/5/11/chartex" xmlns:cx6="http://schemas.microsoft.com/office/drawing/2016/5/12/chartex" xmlns:cx7="http://schemas.microsoft.com/office/drawing/2016/5/13/chartex" xmlns:cx8="http://schemas.microsoft.com/office/drawing/2016/5/14/chartex" xmlns:mc="http://schemas.openxmlformats.org/markup-compatibility/2006" xmlns:aink="http://schemas.microsoft.com/office/drawing/2016/ink" xmlns:am3d="http://schemas.microsoft.com/office/drawing/2017/model3d" xmlns:o="urn:schemas-microsoft-com:office:office" xmlns:oel="http://schemas.microsoft.com/office/2019/extlst" xmlns:r="http://schemas.openxmlformats.org/officeDocument/2006/relationships" xmlns:m="http://schemas.openxmlformats.org/officeDocument/2006/math" xmlns:v="urn:schemas-microsoft-com:vml" xmlns:wp14="http://schemas.microsoft.com/office/word/2010/wordprocessingDrawing" xmlns:wp="http://schemas.openxmlformats.org/drawingml/2006/wordprocessingDrawing" xmlns:w10="urn:schemas-microsoft-com:office:word" xmlns:w="http://schemas.openxmlformats.org/wordprocessingml/2006/main" xmlns:w14="http://schemas.microsoft.com/office/word/2010/wordml" xmlns:w15="http://schemas.microsoft.com/office/word/2012/wordml" xmlns:w16cex="http://schemas.microsoft.com/office/word/2018/wordml/cex" xmlns:w16cid="http://schemas.microsoft.com/office/word/2016/wordml/cid" xmlns:w16="http://schemas.microsoft.com/office/word/2018/wordml" xmlns:w16du="http://schemas.microsoft.com/office/word/2023/wordml/word16du" xmlns:w16sdtdh="http://schemas.microsoft.com/office/word/2020/wordml/sdtdatahash" xmlns:w16sdtfl="http://schemas.microsoft.com/office/word/2024/wordml/sdtformatlock" xmlns:w16se="http://schemas.microsoft.com/office/word/2015/wordml/symex" xmlns:wpg="http://schemas.microsoft.com/office/word/2010/wordprocessingGroup" xmlns:wpi="http://schemas.microsoft.com/office/word/2010/wordprocessingInk" xmlns:wne="http://schemas.microsoft.com/office/word/2006/wordml" xmlns:wps="http://schemas.microsoft.com/office/word/2010/wordprocessingShape" mc:Ignorable="w14 w15 w16se w16cid w16 w16cex w16sdtdh w16sdtfl w16du wp14">
   <w:footnote w:type="separator" w:id="-1">
     <w:p>
       <w:r>
@@ -740,7 +750,7 @@
 </file>
 
 <file path=word/styles.xml><?xml version="1.0" encoding="utf-8"?>
-<w:styles xmlns:mc="http://schemas.openxmlformats.org/markup-compatibility/2006" xmlns:r="http://schemas.openxmlformats.org/officeDocument/2006/relationships" xmlns:w="http://schemas.openxmlformats.org/wordprocessingml/2006/main" xmlns:w14="http://schemas.microsoft.com/office/word/2010/wordml" xmlns:w15="http://schemas.microsoft.com/office/word/2012/wordml" xmlns:w16cex="http://schemas.microsoft.com/office/word/2018/wordml/cex" xmlns:w16cid="http://schemas.microsoft.com/office/word/2016/wordml/cid" xmlns:w16="http://schemas.microsoft.com/office/word/2018/wordml" xmlns:w16sdtdh="http://schemas.microsoft.com/office/word/2020/wordml/sdtdatahash" xmlns:w16se="http://schemas.microsoft.com/office/word/2015/wordml/symex" mc:Ignorable="w14 w15 w16se w16cid w16 w16cex w16sdtdh">
+<w:styles xmlns:mc="http://schemas.openxmlformats.org/markup-compatibility/2006" xmlns:r="http://schemas.openxmlformats.org/officeDocument/2006/relationships" xmlns:w="http://schemas.openxmlformats.org/wordprocessingml/2006/main" xmlns:w14="http://schemas.microsoft.com/office/word/2010/wordml" xmlns:w15="http://schemas.microsoft.com/office/word/2012/wordml" xmlns:w16cex="http://schemas.microsoft.com/office/word/2018/wordml/cex" xmlns:w16cid="http://schemas.microsoft.com/office/word/2016/wordml/cid" xmlns:w16="http://schemas.microsoft.com/office/word/2018/wordml" xmlns:w16du="http://schemas.microsoft.com/office/word/2023/wordml/word16du" xmlns:w16sdtdh="http://schemas.microsoft.com/office/word/2020/wordml/sdtdatahash" xmlns:w16sdtfl="http://schemas.microsoft.com/office/word/2024/wordml/sdtformatlock" xmlns:w16se="http://schemas.microsoft.com/office/word/2015/wordml/symex" mc:Ignorable="w14 w15 w16se w16cid w16 w16cex w16sdtdh w16sdtfl w16du">
   <w:docDefaults>
     <w:rPrDefault>
       <w:rPr>

</xml_diff>